<commit_message>
Finalize RuFLEX article package and deep architecture refresh
</commit_message>
<xml_diff>
--- a/docs/article/article_extended_materials_ru.docx
+++ b/docs/article/article_extended_materials_ru.docx
@@ -207,7 +207,7 @@
           <w:rFonts w:ascii="Times New Roman" w:hAnsi="Times New Roman"/>
           <w:sz w:val="24"/>
         </w:rPr>
-        <w:t>Текущая реализация платформы поддерживает именно такую архитектурную подачу. На уровне спецификации модели используются локальные блоки, стадии и финальный решающий слой. Плоский режим задается одним локальным признаковым блоком и одним решающим слоем. Глубокий режим задается последовательностью стадий, каждая из которых содержит несколько локальных блоков, формирующих скрытые концепты для следующего уровня.</w:t>
+        <w:t>Реализованная версия платформы поддерживает именно такую архитектурную подачу. На уровне спецификации модели используются локальные блоки, стадии и финальный решающий слой. Плоский режим задается одним локальным признаковым блоком и одним решающим слоем. Глубокий режим задается последовательностью стадий, каждая из которых содержит несколько локальных блоков, формирующих скрытые концепты для следующего уровня.</w:t>
       </w:r>
     </w:p>
     <w:p>
@@ -235,7 +235,21 @@
           <w:rFonts w:ascii="Times New Roman" w:hAnsi="Times New Roman"/>
           <w:sz w:val="24"/>
         </w:rPr>
-        <w:t>Платформа уже содержит воспроизводимые конфигурации для режимов flat baseline, flat interpretable, deep compact, deep article demo и deep research, а также согласованные training presets. Поэтому экспериментальное сравнение ведется не между разрозненными скриптами, а внутри единого benchmark-контура.</w:t>
+        <w:t>Важное расширение реализованной архитектуры связано с прямой передачей признаковой информации к решающему слою. Решающий слой может получать не только последний скрытый уровень, но и исходные признаки вместе с финальной или всеми скрытыми стадиями. Кроме того, локальные блоки могут строиться с перекрытием, а их размер варьируется между парами и тройками признаков. Для табличных геоданных это оказалось принципиально: именно такая организация снимает информационную воронку строго последовательного контура и позволяет удерживать полезный исходный сигнал до финального решения.</w:t>
+      </w:r>
+    </w:p>
+    <w:p>
+      <w:pPr>
+        <w:spacing w:after="120"/>
+        <w:ind w:firstLine="360"/>
+        <w:jc w:val="both"/>
+      </w:pPr>
+      <w:r>
+        <w:rPr>
+          <w:rFonts w:ascii="Times New Roman" w:hAnsi="Times New Roman"/>
+          <w:sz w:val="24"/>
+        </w:rPr>
+        <w:t>Платформа уже содержит воспроизводимые конфигурации для плоского базового режима, плоского интерпретируемого режима, строго последовательной глубокой конфигурации, режима с объединением исходных признаков и финальной скрытой стадии и контекстно-обогащенного режима с перекрывающимися блоками. Поэтому экспериментальное сравнение ведется не между разрозненными скриптами, а внутри единого воспроизводимого исследовательского контура.</w:t>
       </w:r>
     </w:p>
     <w:p>
@@ -1851,7 +1865,7 @@
           <w:rFonts w:ascii="Times New Roman" w:hAnsi="Times New Roman"/>
           <w:sz w:val="24"/>
         </w:rPr>
-        <w:t>Такое устройство интерпретационного контура создает структурную основу для более глубокой логической прослеживаемости правил и дальнейшего развития контрфактуального анализа. В текущей версии платформы этот контур уже поддерживает анализ активированных правил, скрытых концептов, траекторий вклада и зависимостей между факторами и итоговым ответом. Однако полная логическая прослеживаемость правил и отдельный контрфактуальный модуль в настоящем исследовании еще не выступают как автономно подтвержденные экспериментальные подсистемы.</w:t>
+        <w:t>Такое устройство интерпретационного контура создает структурную основу для более глубокой логической прослеживаемости правил и дальнейшего развития контрфактуального анализа. Реализованный в платформе интерпретационный контур уже поддерживает анализ активированных правил, скрытых концептов, траекторий вклада и зависимостей между факторами и итоговым ответом. Однако полная логическая прослеживаемость правил и отдельный контрфактуальный модуль в настоящем исследовании еще не выступают как автономно подтвержденные экспериментальные подсистемы.</w:t>
       </w:r>
     </w:p>
     <w:p>
@@ -1888,7 +1902,7 @@
           <w:rFonts w:ascii="Times New Roman" w:hAnsi="Times New Roman"/>
           <w:sz w:val="24"/>
         </w:rPr>
-        <w:t>Для двух задач семейства California Housing использовались подвыборки объема 4096 наблюдений из исходного массива размером 20640 объектов. Для Covertype Binary Geo использовалась сбалансированная подвыборка объема 6000 наблюдений, сформированная из бинаризованной части Forest CoverType, содержащей 495141 допустимый объект из исходного массива размером 581012 строк. Такой дизайн соответствует контролируемому benchmark-исследованию с фиксированным бюджетом данных и вычислений, в котором все внутренние режимы RuFLEX и внешние baseline-модели сравниваются в одинаковых условиях. Следовательно, текущая прикладная валидация относится главным образом к табличному ядру платформы и к встроенному интерпретационному контуру на уровне правил, концептов и факторов.</w:t>
+        <w:t>Для двух задач семейства California Housing использовались подвыборки объема 4096 наблюдений из исходного массива размером 20640 объектов. Для Covertype Binary Geo использовалась сбалансированная подвыборка объема 6000 наблюдений, сформированная из бинаризованной части Forest CoverType, содержащей 495141 допустимый объект из исходного массива размером 581012 строк. Такой дизайн соответствует контролируемому сравнительному исследованию с фиксированным бюджетом данных и вычислений, в котором все внутренние режимы RuFLEX и внешние сравнительные модели сопоставляются в одинаковых условиях. Следовательно, прикладная валидация относится главным образом к табличному ядру платформы и к встроенному интерпретационному контуру на уровне правил, концептов и факторов.</w:t>
       </w:r>
     </w:p>
     <w:p>
@@ -1902,7 +1916,7 @@
           <w:rFonts w:ascii="Times New Roman" w:hAnsi="Times New Roman"/>
           <w:sz w:val="24"/>
         </w:rPr>
-        <w:t>Все основные результаты агрегируются по seed 11, 23 и 47 и приводятся в формате mean ± std. Такой протокол позволяет снизить зависимость выводов от одиночного запуска и делает сравнение архитектурных режимов содержательно более надежным. Вместе с тем эти результаты следует интерпретировать как выводы фиксированного benchmark-сценария, а не как окончательную оценку предельного качества моделей на полных датасетах.</w:t>
+        <w:t>Все основные результаты агрегируются по seed 11, 23 и 47 и приводятся в формате mean ± std. Такой протокол позволяет снизить зависимость выводов от одиночного запуска и делает сравнение архитектурных режимов содержательно более надежным. Вместе с тем эти результаты следует интерпретировать как выводы фиксированного сравнительного сценария, а не как окончательную оценку предельного качества моделей на полных датасетах.</w:t>
       </w:r>
     </w:p>
     <w:p>
@@ -1916,7 +1930,7 @@
           <w:rFonts w:ascii="Times New Roman" w:hAnsi="Times New Roman"/>
           <w:sz w:val="24"/>
         </w:rPr>
-        <w:t>Внутренние абляции RuFLEX включают плоский базовый режим, плоский интерпретируемый режим, умеренно глубокую конфигурацию с одним скрытым уровнем, варианты с ослабленной регуляризацией и более насыщенные исследовательские режимы. Первые две конфигурации здесь выступают как одноуровневые нейро-нечеткие baseline-режимы по типу Сугено, то есть играют роль внутреннего ANFIS-подобного сравнения в общей платформенной среде. Внешняя сравнительная таблица включает линейные модели, случайный лес, многослойный персептрон и градиентный бустинг. Тем самым сравнение ведется одновременно внутри семейства RuFLEX и относительно сильных табличных baseline-моделей.</w:t>
+        <w:t>Внутренние абляции RuFLEX включают плоский базовый режим, плоский интерпретируемый режим, конфигурацию с одним скрытым уровнем, строго последовательную глубокую конфигурацию без прямой передачи исходных признаков к решающему слою, режим с объединением исходных признаков и финальной скрытой стадии, а также контекстный режим с перекрывающимися трехпризнаковыми блоками и объединением нескольких скрытых стадий. Первые две конфигурации здесь выступают как одноуровневые нейро-нечеткие сравнительные режимы по типу Сугено, то есть играют роль внутреннего ANFIS-подобного сравнения в общей платформенной среде. Внешняя сравнительная таблица включает линейные модели, случайный лес, многослойный персептрон и градиентный бустинг. Тем самым сравнение ведется одновременно внутри семейства RuFLEX и относительно сильных табличных сравнительных моделей.</w:t>
       </w:r>
     </w:p>
     <w:p>
@@ -1939,7 +1953,7 @@
           <w:rFonts w:ascii="Times New Roman" w:hAnsi="Times New Roman"/>
           <w:sz w:val="24"/>
         </w:rPr>
-        <w:t>Главным количественным результатом статьи на текущем этапе является регрессионная задача California Housing Regression, уже пересчитанная по seed 11, 23 и 47 с агрегированием mean ± std. Лучший результат внутри семейства RuFLEX показывает глубинная абляция с одним скрытым уровнем:</w:t>
+        <w:t>Главным количественным результатом статьи является то, что на California Housing Regression лучшие внутренние результаты RuFLEX задаются уже не строго последовательной глубокой конфигурацией, а режимами, в которых исходные признаки и промежуточные представления доступны решающему слою. В многосидовом протоколе конфигурация с одним скрытым уровнем дает RMSE = 0.677 ± 0.062, MAE = 0.492 ± 0.036 и R² = 0.625 ± 0.072. Строго последовательная глубокая конфигурация без прямой передачи исходных признаков дает заметно более слабые значения: RMSE = 0.797 ± 0.040, MAE = 0.597 ± 0.014 и R² = 0.482 ± 0.058. Режим с объединением исходных признаков и финальной скрытой стадии дает RMSE = 0.686 ± 0.058, MAE = 0.501 ± 0.034 и R² = 0.615 ± 0.069, а контекстный режим с трехпризнаковыми перекрывающимися блоками дает RMSE = 0.682 ± 0.046, MAE = 0.497 ± 0.019 и R² = 0.620 ± 0.056. Тем самым на геоориентированной табличной регрессии переход от узкого последовательного контура к прямой передаче признаковой информации почти устраняет его внутреннюю архитектурную потерю качества и резко сокращает разрыв между глубоким и компактным режимами.</w:t>
       </w:r>
     </w:p>
     <w:p>
@@ -1953,7 +1967,7 @@
           <w:rFonts w:ascii="Times New Roman" w:hAnsi="Times New Roman"/>
           <w:sz w:val="24"/>
         </w:rPr>
-        <w:t>test_rmse = 0.780 ± 0.033,</w:t>
+        <w:t>В то же время внешние табличные модели на этом датасете оказываются сильнее по чистым предсказательным метрикам. Случайный лес показывает RMSE = 0.571 ± 0.017 и R² = 0.734 ± 0.018, а многослойный персептрон показывает RMSE = 0.582 ± 0.028 и R² = 0.724 ± 0.026. После расширения внешней таблицы наиболее сильной сравнительной моделью на этой задаче оказывается градиентный бустинг: RMSE = 0.505 ± 0.015, MAE = 0.349 ± 0.010 и R² = 0.793 ± 0.013. Следовательно, на компактной табличной георегрессии статья не демонстрирует численного превосходства RuFLEX над сильными внешними сравнительными моделями. Вклад платформы состоит в другом: в объединении гибридной нечеткой архитектуры, внутренней интерпретируемости, архитектурных абляций, воспроизводимого исследовательского контура, Python SDK, веб-интерфейса и Explainability Dashboard.</w:t>
       </w:r>
     </w:p>
     <w:p>
@@ -1967,7 +1981,7 @@
           <w:rFonts w:ascii="Times New Roman" w:hAnsi="Times New Roman"/>
           <w:sz w:val="24"/>
         </w:rPr>
-        <w:t>test_mae = 0.586 ± 0.008,</w:t>
+        <w:t>Классификационная задача California Value Binary Geo показывает еще более отчетливый эффект архитектурной перестройки. Строго последовательная глубокая конфигурация здесь дает accuracy = 0.746 ± 0.008 и F1 = 0.745 ± 0.012. Режим с объединением исходных признаков и финальной скрытой стадии дает accuracy = 0.824 ± 0.010 и F1 = 0.827 ± 0.012, а контекстный режим с перекрывающимися трехпризнаковыми блоками дает лучший средний accuracy, равный 0.825 ± 0.012, при F1 = 0.826 ± 0.015. Конфигурация с одним скрытым уровнем также остается сильной: accuracy = 0.820 ± 0.011 и F1 = 0.823 ± 0.012. Наиболее сильный внешний результат и здесь дает градиентный бустинг: accuracy = 0.892 ± 0.006 и F1 = 0.895 ± 0.007.</w:t>
       </w:r>
     </w:p>
     <w:p>
@@ -1981,539 +1995,7 @@
           <w:rFonts w:ascii="Times New Roman" w:hAnsi="Times New Roman"/>
           <w:sz w:val="24"/>
         </w:rPr>
-        <w:t>test_r2 = 0.504 ± 0.046.</w:t>
-      </w:r>
-    </w:p>
-    <w:p>
-      <w:pPr>
-        <w:spacing w:after="120"/>
-        <w:ind w:firstLine="360"/>
-        <w:jc w:val="both"/>
-      </w:pPr>
-      <w:r>
-        <w:rPr>
-          <w:rFonts w:ascii="Times New Roman" w:hAnsi="Times New Roman"/>
-          <w:sz w:val="24"/>
-        </w:rPr>
-        <w:t>Плоская базовая конфигурация дает</w:t>
-      </w:r>
-    </w:p>
-    <w:p>
-      <w:pPr>
-        <w:spacing w:after="120"/>
-        <w:ind w:firstLine="360"/>
-        <w:jc w:val="both"/>
-      </w:pPr>
-      <w:r>
-        <w:rPr>
-          <w:rFonts w:ascii="Times New Roman" w:hAnsi="Times New Roman"/>
-          <w:sz w:val="24"/>
-        </w:rPr>
-        <w:t>test_rmse = 0.869 ± 0.023,</w:t>
-      </w:r>
-    </w:p>
-    <w:p>
-      <w:pPr>
-        <w:spacing w:after="120"/>
-        <w:ind w:firstLine="360"/>
-        <w:jc w:val="both"/>
-      </w:pPr>
-      <w:r>
-        <w:rPr>
-          <w:rFonts w:ascii="Times New Roman" w:hAnsi="Times New Roman"/>
-          <w:sz w:val="24"/>
-        </w:rPr>
-        <w:t>test_mae = 0.655 ± 0.013,</w:t>
-      </w:r>
-    </w:p>
-    <w:p>
-      <w:pPr>
-        <w:spacing w:after="120"/>
-        <w:ind w:firstLine="360"/>
-        <w:jc w:val="both"/>
-      </w:pPr>
-      <w:r>
-        <w:rPr>
-          <w:rFonts w:ascii="Times New Roman" w:hAnsi="Times New Roman"/>
-          <w:sz w:val="24"/>
-        </w:rPr>
-        <w:t>test_r2 = 0.386 ± 0.038.</w:t>
-      </w:r>
-    </w:p>
-    <w:p>
-      <w:pPr>
-        <w:spacing w:after="120"/>
-        <w:ind w:firstLine="360"/>
-        <w:jc w:val="both"/>
-      </w:pPr>
-      <w:r>
-        <w:rPr>
-          <w:rFonts w:ascii="Times New Roman" w:hAnsi="Times New Roman"/>
-          <w:sz w:val="24"/>
-        </w:rPr>
-        <w:t>Эти значения показывают, что на геоориентированной табличной регрессии переход от плоской конфигурации к умеренно глубокому нечеткому формированию признаков действительно усиливает качество внутри семейства RuFLEX. При этом наиболее удачным оказывается не максимальный по сложности режим, а более компактная глубокая конфигурация.</w:t>
-      </w:r>
-    </w:p>
-    <w:p>
-      <w:pPr>
-        <w:spacing w:after="120"/>
-        <w:ind w:firstLine="360"/>
-        <w:jc w:val="both"/>
-      </w:pPr>
-      <w:r>
-        <w:rPr>
-          <w:rFonts w:ascii="Times New Roman" w:hAnsi="Times New Roman"/>
-          <w:sz w:val="24"/>
-        </w:rPr>
-        <w:t>В то же время внешние табличные модели на этом датасете оказываются сильнее по чистым предсказательным метрикам. Случайный лес показывает</w:t>
-      </w:r>
-    </w:p>
-    <w:p>
-      <w:pPr>
-        <w:spacing w:after="120"/>
-        <w:ind w:firstLine="360"/>
-        <w:jc w:val="both"/>
-      </w:pPr>
-      <w:r>
-        <w:rPr>
-          <w:rFonts w:ascii="Times New Roman" w:hAnsi="Times New Roman"/>
-          <w:sz w:val="24"/>
-        </w:rPr>
-        <w:t>test_rmse = 0.571 ± 0.017,</w:t>
-      </w:r>
-    </w:p>
-    <w:p>
-      <w:pPr>
-        <w:spacing w:after="120"/>
-        <w:ind w:firstLine="360"/>
-        <w:jc w:val="both"/>
-      </w:pPr>
-      <w:r>
-        <w:rPr>
-          <w:rFonts w:ascii="Times New Roman" w:hAnsi="Times New Roman"/>
-          <w:sz w:val="24"/>
-        </w:rPr>
-        <w:t>test_r2 = 0.734 ± 0.018,</w:t>
-      </w:r>
-    </w:p>
-    <w:p>
-      <w:pPr>
-        <w:spacing w:after="120"/>
-        <w:ind w:firstLine="360"/>
-        <w:jc w:val="both"/>
-      </w:pPr>
-      <w:r>
-        <w:rPr>
-          <w:rFonts w:ascii="Times New Roman" w:hAnsi="Times New Roman"/>
-          <w:sz w:val="24"/>
-        </w:rPr>
-        <w:t>а многослойный персептрон показывает</w:t>
-      </w:r>
-    </w:p>
-    <w:p>
-      <w:pPr>
-        <w:spacing w:after="120"/>
-        <w:ind w:firstLine="360"/>
-        <w:jc w:val="both"/>
-      </w:pPr>
-      <w:r>
-        <w:rPr>
-          <w:rFonts w:ascii="Times New Roman" w:hAnsi="Times New Roman"/>
-          <w:sz w:val="24"/>
-        </w:rPr>
-        <w:t>test_rmse = 0.582 ± 0.028,</w:t>
-      </w:r>
-    </w:p>
-    <w:p>
-      <w:pPr>
-        <w:spacing w:after="120"/>
-        <w:ind w:firstLine="360"/>
-        <w:jc w:val="both"/>
-      </w:pPr>
-      <w:r>
-        <w:rPr>
-          <w:rFonts w:ascii="Times New Roman" w:hAnsi="Times New Roman"/>
-          <w:sz w:val="24"/>
-        </w:rPr>
-        <w:t>test_r2 = 0.724 ± 0.026.</w:t>
-      </w:r>
-    </w:p>
-    <w:p>
-      <w:pPr>
-        <w:spacing w:after="120"/>
-        <w:ind w:firstLine="360"/>
-        <w:jc w:val="both"/>
-      </w:pPr>
-      <w:r>
-        <w:rPr>
-          <w:rFonts w:ascii="Times New Roman" w:hAnsi="Times New Roman"/>
-          <w:sz w:val="24"/>
-        </w:rPr>
-        <w:t>После расширения внешней таблицы наиболее сильным baseline на этой задаче оказывается градиентный бустинг:</w:t>
-      </w:r>
-    </w:p>
-    <w:p>
-      <w:pPr>
-        <w:spacing w:after="120"/>
-        <w:ind w:firstLine="360"/>
-        <w:jc w:val="both"/>
-      </w:pPr>
-      <w:r>
-        <w:rPr>
-          <w:rFonts w:ascii="Times New Roman" w:hAnsi="Times New Roman"/>
-          <w:sz w:val="24"/>
-        </w:rPr>
-        <w:t>test_rmse = 0.505 ± 0.015,</w:t>
-      </w:r>
-    </w:p>
-    <w:p>
-      <w:pPr>
-        <w:spacing w:after="120"/>
-        <w:ind w:firstLine="360"/>
-        <w:jc w:val="both"/>
-      </w:pPr>
-      <w:r>
-        <w:rPr>
-          <w:rFonts w:ascii="Times New Roman" w:hAnsi="Times New Roman"/>
-          <w:sz w:val="24"/>
-        </w:rPr>
-        <w:t>test_mae = 0.349 ± 0.010,</w:t>
-      </w:r>
-    </w:p>
-    <w:p>
-      <w:pPr>
-        <w:spacing w:after="120"/>
-        <w:ind w:firstLine="360"/>
-        <w:jc w:val="both"/>
-      </w:pPr>
-      <w:r>
-        <w:rPr>
-          <w:rFonts w:ascii="Times New Roman" w:hAnsi="Times New Roman"/>
-          <w:sz w:val="24"/>
-        </w:rPr>
-        <w:t>test_r2 = 0.793 ± 0.013.</w:t>
-      </w:r>
-    </w:p>
-    <w:p>
-      <w:pPr>
-        <w:spacing w:after="120"/>
-        <w:ind w:firstLine="360"/>
-        <w:jc w:val="both"/>
-      </w:pPr>
-      <w:r>
-        <w:rPr>
-          <w:rFonts w:ascii="Times New Roman" w:hAnsi="Times New Roman"/>
-          <w:sz w:val="24"/>
-        </w:rPr>
-        <w:t>Следовательно, на компактной табличной георегрессии статья не демонстрирует численного превосходства RuFLEX над сильными внешними baseline-моделями. Вклад платформы состоит в другом: в объединении гибридной нечеткой архитектуры, внутренней интерпретируемости, архитектурных абляций, воспроизводимого benchmark-контура, Python SDK, веб-интерфейса и Explainability Dashboard.</w:t>
-      </w:r>
-    </w:p>
-    <w:p>
-      <w:pPr>
-        <w:spacing w:after="120"/>
-        <w:ind w:firstLine="360"/>
-        <w:jc w:val="both"/>
-      </w:pPr>
-      <w:r>
-        <w:rPr>
-          <w:rFonts w:ascii="Times New Roman" w:hAnsi="Times New Roman"/>
-          <w:sz w:val="24"/>
-        </w:rPr>
-        <w:t>Классификационная задача California Value Binary Geo, также пересчитанная по seed 11, 23 и 47, показывает, что конфигурация Deep Depth 1 дает лучший внутри RuFLEX результат по accuracy и один из лучших результатов по F1. Для нее получаем</w:t>
-      </w:r>
-    </w:p>
-    <w:p>
-      <w:pPr>
-        <w:spacing w:after="120"/>
-        <w:ind w:firstLine="360"/>
-        <w:jc w:val="both"/>
-      </w:pPr>
-      <w:r>
-        <w:rPr>
-          <w:rFonts w:ascii="Times New Roman" w:hAnsi="Times New Roman"/>
-          <w:sz w:val="24"/>
-        </w:rPr>
-        <w:t>test_accuracy = 0.751 ± 0.008</w:t>
-      </w:r>
-    </w:p>
-    <w:p>
-      <w:pPr>
-        <w:spacing w:after="120"/>
-        <w:ind w:firstLine="360"/>
-        <w:jc w:val="both"/>
-      </w:pPr>
-      <w:r>
-        <w:rPr>
-          <w:rFonts w:ascii="Times New Roman" w:hAnsi="Times New Roman"/>
-          <w:sz w:val="24"/>
-        </w:rPr>
-        <w:t>и</w:t>
-      </w:r>
-    </w:p>
-    <w:p>
-      <w:pPr>
-        <w:spacing w:after="120"/>
-        <w:ind w:firstLine="360"/>
-        <w:jc w:val="both"/>
-      </w:pPr>
-      <w:r>
-        <w:rPr>
-          <w:rFonts w:ascii="Times New Roman" w:hAnsi="Times New Roman"/>
-          <w:sz w:val="24"/>
-        </w:rPr>
-        <w:t>test_f1 = 0.745 ± 0.009.</w:t>
-      </w:r>
-    </w:p>
-    <w:p>
-      <w:pPr>
-        <w:spacing w:after="120"/>
-        <w:ind w:firstLine="360"/>
-        <w:jc w:val="both"/>
-      </w:pPr>
-      <w:r>
-        <w:rPr>
-          <w:rFonts w:ascii="Times New Roman" w:hAnsi="Times New Roman"/>
-          <w:sz w:val="24"/>
-        </w:rPr>
-        <w:t>При этом конфигурация Deep No Regularization дает немного более высокий средний</w:t>
-      </w:r>
-    </w:p>
-    <w:p>
-      <w:pPr>
-        <w:spacing w:after="120"/>
-        <w:ind w:firstLine="360"/>
-        <w:jc w:val="both"/>
-      </w:pPr>
-      <w:r>
-        <w:rPr>
-          <w:rFonts w:ascii="Times New Roman" w:hAnsi="Times New Roman"/>
-          <w:sz w:val="24"/>
-        </w:rPr>
-        <w:t>test_f1 = 0.748 ± 0.014,</w:t>
-      </w:r>
-    </w:p>
-    <w:p>
-      <w:pPr>
-        <w:spacing w:after="120"/>
-        <w:ind w:firstLine="360"/>
-        <w:jc w:val="both"/>
-      </w:pPr>
-      <w:r>
-        <w:rPr>
-          <w:rFonts w:ascii="Times New Roman" w:hAnsi="Times New Roman"/>
-          <w:sz w:val="24"/>
-        </w:rPr>
-        <w:t>но это различие остается в пределах наблюдаемого разброса по seed.</w:t>
-      </w:r>
-    </w:p>
-    <w:p>
-      <w:pPr>
-        <w:spacing w:after="120"/>
-        <w:ind w:firstLine="360"/>
-        <w:jc w:val="both"/>
-      </w:pPr>
-      <w:r>
-        <w:rPr>
-          <w:rFonts w:ascii="Times New Roman" w:hAnsi="Times New Roman"/>
-          <w:sz w:val="24"/>
-        </w:rPr>
-        <w:t>При этом flat interpretable оказывается заметно менее устойчивым:</w:t>
-      </w:r>
-    </w:p>
-    <w:p>
-      <w:pPr>
-        <w:spacing w:after="120"/>
-        <w:ind w:firstLine="360"/>
-        <w:jc w:val="both"/>
-      </w:pPr>
-      <w:r>
-        <w:rPr>
-          <w:rFonts w:ascii="Times New Roman" w:hAnsi="Times New Roman"/>
-          <w:sz w:val="24"/>
-        </w:rPr>
-        <w:t>test_accuracy = 0.650 ± 0.117,</w:t>
-      </w:r>
-    </w:p>
-    <w:p>
-      <w:pPr>
-        <w:spacing w:after="120"/>
-        <w:ind w:firstLine="360"/>
-        <w:jc w:val="both"/>
-      </w:pPr>
-      <w:r>
-        <w:rPr>
-          <w:rFonts w:ascii="Times New Roman" w:hAnsi="Times New Roman"/>
-          <w:sz w:val="24"/>
-        </w:rPr>
-        <w:t>test_f1 = 0.482 ± 0.341.</w:t>
-      </w:r>
-    </w:p>
-    <w:p>
-      <w:pPr>
-        <w:spacing w:after="120"/>
-        <w:ind w:firstLine="360"/>
-        <w:jc w:val="both"/>
-      </w:pPr>
-      <w:r>
-        <w:rPr>
-          <w:rFonts w:ascii="Times New Roman" w:hAnsi="Times New Roman"/>
-          <w:sz w:val="24"/>
-        </w:rPr>
-        <w:t>Наиболее сильный внешний результат и здесь дает градиентный бустинг:</w:t>
-      </w:r>
-    </w:p>
-    <w:p>
-      <w:pPr>
-        <w:spacing w:after="120"/>
-        <w:ind w:firstLine="360"/>
-        <w:jc w:val="both"/>
-      </w:pPr>
-      <w:r>
-        <w:rPr>
-          <w:rFonts w:ascii="Times New Roman" w:hAnsi="Times New Roman"/>
-          <w:sz w:val="24"/>
-        </w:rPr>
-        <w:t>test_accuracy = 0.892 ± 0.006,</w:t>
-      </w:r>
-    </w:p>
-    <w:p>
-      <w:pPr>
-        <w:spacing w:after="120"/>
-        <w:ind w:firstLine="360"/>
-        <w:jc w:val="both"/>
-      </w:pPr>
-      <w:r>
-        <w:rPr>
-          <w:rFonts w:ascii="Times New Roman" w:hAnsi="Times New Roman"/>
-          <w:sz w:val="24"/>
-        </w:rPr>
-        <w:t>test_f1 = 0.895 ± 0.007.</w:t>
-      </w:r>
-    </w:p>
-    <w:p>
-      <w:pPr>
-        <w:spacing w:after="120"/>
-        <w:ind w:firstLine="360"/>
-        <w:jc w:val="both"/>
-      </w:pPr>
-      <w:r>
-        <w:rPr>
-          <w:rFonts w:ascii="Times New Roman" w:hAnsi="Times New Roman"/>
-          <w:sz w:val="24"/>
-        </w:rPr>
-        <w:t>Независимая задача Covertype Binary Geo введена в расширенные материалы не как еще одна демонстрация качества, а как стресс-тест и негативный контроль для текущего табличного контура. На ней лучший вариант внутри RuFLEX, конфигурация Deep Research, показывает</w:t>
-      </w:r>
-    </w:p>
-    <w:p>
-      <w:pPr>
-        <w:spacing w:after="120"/>
-        <w:ind w:firstLine="360"/>
-        <w:jc w:val="both"/>
-      </w:pPr>
-      <w:r>
-        <w:rPr>
-          <w:rFonts w:ascii="Times New Roman" w:hAnsi="Times New Roman"/>
-          <w:sz w:val="24"/>
-        </w:rPr>
-        <w:t>test_accuracy = 0.499 ± 0.007</w:t>
-      </w:r>
-    </w:p>
-    <w:p>
-      <w:pPr>
-        <w:spacing w:after="120"/>
-        <w:ind w:firstLine="360"/>
-        <w:jc w:val="both"/>
-      </w:pPr>
-      <w:r>
-        <w:rPr>
-          <w:rFonts w:ascii="Times New Roman" w:hAnsi="Times New Roman"/>
-          <w:sz w:val="24"/>
-        </w:rPr>
-        <w:t>и</w:t>
-      </w:r>
-    </w:p>
-    <w:p>
-      <w:pPr>
-        <w:spacing w:after="120"/>
-        <w:ind w:firstLine="360"/>
-        <w:jc w:val="both"/>
-      </w:pPr>
-      <w:r>
-        <w:rPr>
-          <w:rFonts w:ascii="Times New Roman" w:hAnsi="Times New Roman"/>
-          <w:sz w:val="24"/>
-        </w:rPr>
-        <w:t>test_f1 = 0.321 ± 0.272,</w:t>
-      </w:r>
-    </w:p>
-    <w:p>
-      <w:pPr>
-        <w:spacing w:after="120"/>
-        <w:ind w:firstLine="360"/>
-        <w:jc w:val="both"/>
-      </w:pPr>
-      <w:r>
-        <w:rPr>
-          <w:rFonts w:ascii="Times New Roman" w:hAnsi="Times New Roman"/>
-          <w:sz w:val="24"/>
-        </w:rPr>
-        <w:t>тогда как случайный лес дает</w:t>
-      </w:r>
-    </w:p>
-    <w:p>
-      <w:pPr>
-        <w:spacing w:after="120"/>
-        <w:ind w:firstLine="360"/>
-        <w:jc w:val="both"/>
-      </w:pPr>
-      <w:r>
-        <w:rPr>
-          <w:rFonts w:ascii="Times New Roman" w:hAnsi="Times New Roman"/>
-          <w:sz w:val="24"/>
-        </w:rPr>
-        <w:t>test_accuracy = 0.804 ± 0.001</w:t>
-      </w:r>
-    </w:p>
-    <w:p>
-      <w:pPr>
-        <w:spacing w:after="120"/>
-        <w:ind w:firstLine="360"/>
-        <w:jc w:val="both"/>
-      </w:pPr>
-      <w:r>
-        <w:rPr>
-          <w:rFonts w:ascii="Times New Roman" w:hAnsi="Times New Roman"/>
-          <w:sz w:val="24"/>
-        </w:rPr>
-        <w:t>и</w:t>
-      </w:r>
-    </w:p>
-    <w:p>
-      <w:pPr>
-        <w:spacing w:after="120"/>
-        <w:ind w:firstLine="360"/>
-        <w:jc w:val="both"/>
-      </w:pPr>
-      <w:r>
-        <w:rPr>
-          <w:rFonts w:ascii="Times New Roman" w:hAnsi="Times New Roman"/>
-          <w:sz w:val="24"/>
-        </w:rPr>
-        <w:t>test_f1 = 0.808 ± 0.001.</w:t>
-      </w:r>
-    </w:p>
-    <w:p>
-      <w:pPr>
-        <w:spacing w:after="120"/>
-        <w:ind w:firstLine="360"/>
-        <w:jc w:val="both"/>
-      </w:pPr>
-      <w:r>
-        <w:rPr>
-          <w:rFonts w:ascii="Times New Roman" w:hAnsi="Times New Roman"/>
-          <w:sz w:val="24"/>
-        </w:rPr>
-        <w:t>Этот результат не следует трактовать как неудачную равноправную третью задачу на качество. Его смысл состоит в том, чтобы зафиксировать границу применимости текущего табличного режима. Для более сложных картографических данных текущему табличному нечеткому контуру недостаточно просто варьировать глубину и регуляризацию. Здесь особенно существенным становится дальнейшее развитие пространственного направления и более богатых архитектурных связей.</w:t>
+        <w:t>Независимая задача Covertype Binary Geo теперь выполняет роль жесткого стресс-теста, на котором хорошо видна цена архитектурного выбора. Строго последовательная глубокая конфигурация здесь фактически деградирует до почти случайного решения: accuracy = 0.497 ± 0.015 и F1 = 0.225 ± 0.390. Напротив, конфигурация с одним скрытым уровнем и режим с объединением исходных признаков и финальной скрытой стадии практически совпадают по среднему качеству и выходят на уровень accuracy ≈ 0.772 и F1 ≈ 0.772, а контекстный режим дает accuracy = 0.770 ± 0.011 и F1 = 0.771 ± 0.016, тогда как случайный лес дает accuracy = 0.804 ± 0.001 и F1 = 0.808 ± 0.001. Этот результат уже не следует трактовать как внутренний провал глубокого контура. Напротив, он показывает, что правильная передача исходных признаков и скрытых концептов почти полностью устраняет архитектурную деградацию строгой последовательной схемы. Вместе с тем разрыв с сильными древесными ансамблями и другими внешними сравнительными моделями сохраняется, поэтому Covertype по-прежнему фиксирует границу применимости текущего табличного режима и поддерживает необходимость дальнейшего развития пространственного направления.</w:t>
       </w:r>
     </w:p>
     <w:p>
@@ -2550,7 +2032,7 @@
           <w:rFonts w:ascii="Times New Roman" w:hAnsi="Times New Roman"/>
           <w:sz w:val="24"/>
         </w:rPr>
-        <w:t>Чтобы проверить устойчивость основных выводов при росте объема данных, была проведена отдельная дополнительная серия на увеличенных выборках. Эта серия не заменяет базовый benchmark статьи и не подменяет основную сравнительную таблицу, а служит проверкой того, сохраняется ли внутренний тренд семейства RuFLEX при ослаблении ограничения по размеру выборки.</w:t>
+        <w:t>Чтобы проверить устойчивость основных выводов при росте объема данных, была проведена отдельная дополнительная серия на увеличенных выборках. Эта серия не заменяет базовую часть статьи и не подменяет основную сравнительную таблицу, а служит проверкой того, сохраняется ли внутренний тренд семейства RuFLEX при ослаблении ограничения по размеру выборки.</w:t>
       </w:r>
     </w:p>
     <w:p>
@@ -2564,7 +2046,7 @@
           <w:rFonts w:ascii="Times New Roman" w:hAnsi="Times New Roman"/>
           <w:sz w:val="24"/>
         </w:rPr>
-        <w:t>Для регрессионной задачи California Housing Regression был использован полный массив из 20640 наблюдений с тем же агрегированием по seed 11, 23 и 47. На этой серии плоская базовая конфигурация дает</w:t>
+        <w:t>Для регрессионной задачи California Housing Regression был использован полный массив из 20640 наблюдений в режиме дополнительной проверки на увеличенной выборке. На этой серии строго последовательная глубокая конфигурация дает RMSE = 0.799, MAE = 0.592 и R² = 0.513, тогда как режим с объединением исходных признаков и финальной скрытой стадии дает RMSE = 0.706, MAE = 0.497 и R² = 0.620, а контекстный режим дает RMSE = 0.705, MAE = 0.494 и R² = 0.621. Тем самым на полном регрессионном массиве внутренний выигрыш конфигураций с прямой передачей признаков не исчезает, а становится еще более наглядным, чем на базовой подвыборке. Вместе с тем сильнейшим внешним baseline и на этой серии остается градиентный бустинг: RMSE = 0.486 ± 0.001, MAE = 0.334 ± 0.001 и R² = 0.826 ± 0.001.</w:t>
       </w:r>
     </w:p>
     <w:p>
@@ -2578,7 +2060,16 @@
           <w:rFonts w:ascii="Times New Roman" w:hAnsi="Times New Roman"/>
           <w:sz w:val="24"/>
         </w:rPr>
-        <w:t>test_rmse = 0.940 ± 0.159,</w:t>
+        <w:t>Для классификационной постановки California Value Binary Geo была подготовлена увеличенная сбалансированная выборка объема 16000 наблюдений. На ней строго последовательная глубокая конфигурация дает accuracy = 0.764 и F1 = 0.746, тогда как режим с объединением исходных признаков и финальной скрытой стадии дает accuracy = 0.844 и F1 = 0.840, а контекстный режим дает лучший результат внутри этой дополнительной серии: accuracy = 0.847 и F1 = 0.846. Как и в базовой серии, внешние табличные методы остаются сильнее по чистой метрике; наиболее сильной сравнительной моделью здесь снова выступает градиентный бустинг: accuracy = 0.901 ± 0.001 и F1 = 0.901 ± 0.001. Содержательно эта дополнительная серия важна тем, что она не просто сохраняет внутренний выигрыш глубины, а конкретизирует его механизм. При росте объема данных сильнее всего раскрываются именно конфигурации, которые не теряют исходный сигнал и промежуточные концепты на пути к решающему слою. Одновременно такая дополнительная проверка не отменяет платформенного позиционирования работы: даже при росте выборки RuFLEX пока не превосходит сильные внешние бустинговые и ансамблевые сравнительные модели по абсолютной метрике.</w:t>
+      </w:r>
+    </w:p>
+    <w:p>
+      <w:pPr>
+        <w:pStyle w:val="Heading1"/>
+        <w:jc w:val="left"/>
+      </w:pPr>
+      <w:r>
+        <w:t>13. Ограничения и границы интерпретации</w:t>
       </w:r>
     </w:p>
     <w:p>
@@ -2592,506 +2083,7 @@
           <w:rFonts w:ascii="Times New Roman" w:hAnsi="Times New Roman"/>
           <w:sz w:val="24"/>
         </w:rPr>
-        <w:t>test_mae = 0.720 ± 0.140,</w:t>
-      </w:r>
-    </w:p>
-    <w:p>
-      <w:pPr>
-        <w:spacing w:after="120"/>
-        <w:ind w:firstLine="360"/>
-        <w:jc w:val="both"/>
-      </w:pPr>
-      <w:r>
-        <w:rPr>
-          <w:rFonts w:ascii="Times New Roman" w:hAnsi="Times New Roman"/>
-          <w:sz w:val="24"/>
-        </w:rPr>
-        <w:t>test_r2 = 0.329 ± 0.233.</w:t>
-      </w:r>
-    </w:p>
-    <w:p>
-      <w:pPr>
-        <w:spacing w:after="120"/>
-        <w:ind w:firstLine="360"/>
-        <w:jc w:val="both"/>
-      </w:pPr>
-      <w:r>
-        <w:rPr>
-          <w:rFonts w:ascii="Times New Roman" w:hAnsi="Times New Roman"/>
-          <w:sz w:val="24"/>
-        </w:rPr>
-        <w:t>Глубокая конфигурация Deep Depth 1 на тех же данных показывает</w:t>
-      </w:r>
-    </w:p>
-    <w:p>
-      <w:pPr>
-        <w:spacing w:after="120"/>
-        <w:ind w:firstLine="360"/>
-        <w:jc w:val="both"/>
-      </w:pPr>
-      <w:r>
-        <w:rPr>
-          <w:rFonts w:ascii="Times New Roman" w:hAnsi="Times New Roman"/>
-          <w:sz w:val="24"/>
-        </w:rPr>
-        <w:t>test_rmse = 0.786 ± 0.005,</w:t>
-      </w:r>
-    </w:p>
-    <w:p>
-      <w:pPr>
-        <w:spacing w:after="120"/>
-        <w:ind w:firstLine="360"/>
-        <w:jc w:val="both"/>
-      </w:pPr>
-      <w:r>
-        <w:rPr>
-          <w:rFonts w:ascii="Times New Roman" w:hAnsi="Times New Roman"/>
-          <w:sz w:val="24"/>
-        </w:rPr>
-        <w:t>test_mae = 0.591 ± 0.003,</w:t>
-      </w:r>
-    </w:p>
-    <w:p>
-      <w:pPr>
-        <w:spacing w:after="120"/>
-        <w:ind w:firstLine="360"/>
-        <w:jc w:val="both"/>
-      </w:pPr>
-      <w:r>
-        <w:rPr>
-          <w:rFonts w:ascii="Times New Roman" w:hAnsi="Times New Roman"/>
-          <w:sz w:val="24"/>
-        </w:rPr>
-        <w:t>test_r2 = 0.544 ± 0.008,</w:t>
-      </w:r>
-    </w:p>
-    <w:p>
-      <w:pPr>
-        <w:spacing w:after="120"/>
-        <w:ind w:firstLine="360"/>
-        <w:jc w:val="both"/>
-      </w:pPr>
-      <w:r>
-        <w:rPr>
-          <w:rFonts w:ascii="Times New Roman" w:hAnsi="Times New Roman"/>
-          <w:sz w:val="24"/>
-        </w:rPr>
-        <w:t>а конфигурация Deep Article Demo дает практически те же значения:</w:t>
-      </w:r>
-    </w:p>
-    <w:p>
-      <w:pPr>
-        <w:spacing w:after="120"/>
-        <w:ind w:firstLine="360"/>
-        <w:jc w:val="both"/>
-      </w:pPr>
-      <w:r>
-        <w:rPr>
-          <w:rFonts w:ascii="Times New Roman" w:hAnsi="Times New Roman"/>
-          <w:sz w:val="24"/>
-        </w:rPr>
-        <w:t>test_rmse = 0.786 ± 0.005,</w:t>
-      </w:r>
-    </w:p>
-    <w:p>
-      <w:pPr>
-        <w:spacing w:after="120"/>
-        <w:ind w:firstLine="360"/>
-        <w:jc w:val="both"/>
-      </w:pPr>
-      <w:r>
-        <w:rPr>
-          <w:rFonts w:ascii="Times New Roman" w:hAnsi="Times New Roman"/>
-          <w:sz w:val="24"/>
-        </w:rPr>
-        <w:t>test_mae = 0.590 ± 0.003,</w:t>
-      </w:r>
-    </w:p>
-    <w:p>
-      <w:pPr>
-        <w:spacing w:after="120"/>
-        <w:ind w:firstLine="360"/>
-        <w:jc w:val="both"/>
-      </w:pPr>
-      <w:r>
-        <w:rPr>
-          <w:rFonts w:ascii="Times New Roman" w:hAnsi="Times New Roman"/>
-          <w:sz w:val="24"/>
-        </w:rPr>
-        <w:t>test_r2 = 0.543 ± 0.008.</w:t>
-      </w:r>
-    </w:p>
-    <w:p>
-      <w:pPr>
-        <w:spacing w:after="120"/>
-        <w:ind w:firstLine="360"/>
-        <w:jc w:val="both"/>
-      </w:pPr>
-      <w:r>
-        <w:rPr>
-          <w:rFonts w:ascii="Times New Roman" w:hAnsi="Times New Roman"/>
-          <w:sz w:val="24"/>
-        </w:rPr>
-        <w:t>Тем самым на полном регрессионном массиве внутренний выигрыш глубины внутри RuFLEX не исчезает, а, напротив, проявляется устойчиво и с заметно меньшим разбросом, чем у плоской базовой конфигурации. Вместе с тем сильнейшим внешним baseline и на этой серии остается градиентный бустинг:</w:t>
-      </w:r>
-    </w:p>
-    <w:p>
-      <w:pPr>
-        <w:spacing w:after="120"/>
-        <w:ind w:firstLine="360"/>
-        <w:jc w:val="both"/>
-      </w:pPr>
-      <w:r>
-        <w:rPr>
-          <w:rFonts w:ascii="Times New Roman" w:hAnsi="Times New Roman"/>
-          <w:sz w:val="24"/>
-        </w:rPr>
-        <w:t>test_rmse = 0.486 ± 0.001,</w:t>
-      </w:r>
-    </w:p>
-    <w:p>
-      <w:pPr>
-        <w:spacing w:after="120"/>
-        <w:ind w:firstLine="360"/>
-        <w:jc w:val="both"/>
-      </w:pPr>
-      <w:r>
-        <w:rPr>
-          <w:rFonts w:ascii="Times New Roman" w:hAnsi="Times New Roman"/>
-          <w:sz w:val="24"/>
-        </w:rPr>
-        <w:t>test_mae = 0.334 ± 0.001,</w:t>
-      </w:r>
-    </w:p>
-    <w:p>
-      <w:pPr>
-        <w:spacing w:after="120"/>
-        <w:ind w:firstLine="360"/>
-        <w:jc w:val="both"/>
-      </w:pPr>
-      <w:r>
-        <w:rPr>
-          <w:rFonts w:ascii="Times New Roman" w:hAnsi="Times New Roman"/>
-          <w:sz w:val="24"/>
-        </w:rPr>
-        <w:t>test_r2 = 0.826 ± 0.001.</w:t>
-      </w:r>
-    </w:p>
-    <w:p>
-      <w:pPr>
-        <w:spacing w:after="120"/>
-        <w:ind w:firstLine="360"/>
-        <w:jc w:val="both"/>
-      </w:pPr>
-      <w:r>
-        <w:rPr>
-          <w:rFonts w:ascii="Times New Roman" w:hAnsi="Times New Roman"/>
-          <w:sz w:val="24"/>
-        </w:rPr>
-        <w:t>Для классификационной постановки California Value Binary Geo была подготовлена увеличенная сбалансированная выборка объема 16000 наблюдений. На ней плоская базовая конфигурация показывает</w:t>
-      </w:r>
-    </w:p>
-    <w:p>
-      <w:pPr>
-        <w:spacing w:after="120"/>
-        <w:ind w:firstLine="360"/>
-        <w:jc w:val="both"/>
-      </w:pPr>
-      <w:r>
-        <w:rPr>
-          <w:rFonts w:ascii="Times New Roman" w:hAnsi="Times New Roman"/>
-          <w:sz w:val="24"/>
-        </w:rPr>
-        <w:t>test_accuracy = 0.745 ± 0.001</w:t>
-      </w:r>
-    </w:p>
-    <w:p>
-      <w:pPr>
-        <w:spacing w:after="120"/>
-        <w:ind w:firstLine="360"/>
-        <w:jc w:val="both"/>
-      </w:pPr>
-      <w:r>
-        <w:rPr>
-          <w:rFonts w:ascii="Times New Roman" w:hAnsi="Times New Roman"/>
-          <w:sz w:val="24"/>
-        </w:rPr>
-        <w:t>и</w:t>
-      </w:r>
-    </w:p>
-    <w:p>
-      <w:pPr>
-        <w:spacing w:after="120"/>
-        <w:ind w:firstLine="360"/>
-        <w:jc w:val="both"/>
-      </w:pPr>
-      <w:r>
-        <w:rPr>
-          <w:rFonts w:ascii="Times New Roman" w:hAnsi="Times New Roman"/>
-          <w:sz w:val="24"/>
-        </w:rPr>
-        <w:t>test_f1 = 0.732 ± 0.006.</w:t>
-      </w:r>
-    </w:p>
-    <w:p>
-      <w:pPr>
-        <w:spacing w:after="120"/>
-        <w:ind w:firstLine="360"/>
-        <w:jc w:val="both"/>
-      </w:pPr>
-      <w:r>
-        <w:rPr>
-          <w:rFonts w:ascii="Times New Roman" w:hAnsi="Times New Roman"/>
-          <w:sz w:val="24"/>
-        </w:rPr>
-        <w:t>Конфигурация Deep Depth 1 дает</w:t>
-      </w:r>
-    </w:p>
-    <w:p>
-      <w:pPr>
-        <w:spacing w:after="120"/>
-        <w:ind w:firstLine="360"/>
-        <w:jc w:val="both"/>
-      </w:pPr>
-      <w:r>
-        <w:rPr>
-          <w:rFonts w:ascii="Times New Roman" w:hAnsi="Times New Roman"/>
-          <w:sz w:val="24"/>
-        </w:rPr>
-        <w:t>test_accuracy = 0.762 ± 0.006</w:t>
-      </w:r>
-    </w:p>
-    <w:p>
-      <w:pPr>
-        <w:spacing w:after="120"/>
-        <w:ind w:firstLine="360"/>
-        <w:jc w:val="both"/>
-      </w:pPr>
-      <w:r>
-        <w:rPr>
-          <w:rFonts w:ascii="Times New Roman" w:hAnsi="Times New Roman"/>
-          <w:sz w:val="24"/>
-        </w:rPr>
-        <w:t>и</w:t>
-      </w:r>
-    </w:p>
-    <w:p>
-      <w:pPr>
-        <w:spacing w:after="120"/>
-        <w:ind w:firstLine="360"/>
-        <w:jc w:val="both"/>
-      </w:pPr>
-      <w:r>
-        <w:rPr>
-          <w:rFonts w:ascii="Times New Roman" w:hAnsi="Times New Roman"/>
-          <w:sz w:val="24"/>
-        </w:rPr>
-        <w:t>test_f1 = 0.748 ± 0.006,</w:t>
-      </w:r>
-    </w:p>
-    <w:p>
-      <w:pPr>
-        <w:spacing w:after="120"/>
-        <w:ind w:firstLine="360"/>
-        <w:jc w:val="both"/>
-      </w:pPr>
-      <w:r>
-        <w:rPr>
-          <w:rFonts w:ascii="Times New Roman" w:hAnsi="Times New Roman"/>
-          <w:sz w:val="24"/>
-        </w:rPr>
-        <w:t>Deep Article Demo дает</w:t>
-      </w:r>
-    </w:p>
-    <w:p>
-      <w:pPr>
-        <w:spacing w:after="120"/>
-        <w:ind w:firstLine="360"/>
-        <w:jc w:val="both"/>
-      </w:pPr>
-      <w:r>
-        <w:rPr>
-          <w:rFonts w:ascii="Times New Roman" w:hAnsi="Times New Roman"/>
-          <w:sz w:val="24"/>
-        </w:rPr>
-        <w:t>test_accuracy = 0.762 ± 0.006</w:t>
-      </w:r>
-    </w:p>
-    <w:p>
-      <w:pPr>
-        <w:spacing w:after="120"/>
-        <w:ind w:firstLine="360"/>
-        <w:jc w:val="both"/>
-      </w:pPr>
-      <w:r>
-        <w:rPr>
-          <w:rFonts w:ascii="Times New Roman" w:hAnsi="Times New Roman"/>
-          <w:sz w:val="24"/>
-        </w:rPr>
-        <w:t>и</w:t>
-      </w:r>
-    </w:p>
-    <w:p>
-      <w:pPr>
-        <w:spacing w:after="120"/>
-        <w:ind w:firstLine="360"/>
-        <w:jc w:val="both"/>
-      </w:pPr>
-      <w:r>
-        <w:rPr>
-          <w:rFonts w:ascii="Times New Roman" w:hAnsi="Times New Roman"/>
-          <w:sz w:val="24"/>
-        </w:rPr>
-        <w:t>test_f1 = 0.749 ± 0.006,</w:t>
-      </w:r>
-    </w:p>
-    <w:p>
-      <w:pPr>
-        <w:spacing w:after="120"/>
-        <w:ind w:firstLine="360"/>
-        <w:jc w:val="both"/>
-      </w:pPr>
-      <w:r>
-        <w:rPr>
-          <w:rFonts w:ascii="Times New Roman" w:hAnsi="Times New Roman"/>
-          <w:sz w:val="24"/>
-        </w:rPr>
-        <w:t>а Deep No Regularization показывает лучший результат внутри этой enlarged-серии:</w:t>
-      </w:r>
-    </w:p>
-    <w:p>
-      <w:pPr>
-        <w:spacing w:after="120"/>
-        <w:ind w:firstLine="360"/>
-        <w:jc w:val="both"/>
-      </w:pPr>
-      <w:r>
-        <w:rPr>
-          <w:rFonts w:ascii="Times New Roman" w:hAnsi="Times New Roman"/>
-          <w:sz w:val="24"/>
-        </w:rPr>
-        <w:t>test_accuracy = 0.763 ± 0.011</w:t>
-      </w:r>
-    </w:p>
-    <w:p>
-      <w:pPr>
-        <w:spacing w:after="120"/>
-        <w:ind w:firstLine="360"/>
-        <w:jc w:val="both"/>
-      </w:pPr>
-      <w:r>
-        <w:rPr>
-          <w:rFonts w:ascii="Times New Roman" w:hAnsi="Times New Roman"/>
-          <w:sz w:val="24"/>
-        </w:rPr>
-        <w:t>и</w:t>
-      </w:r>
-    </w:p>
-    <w:p>
-      <w:pPr>
-        <w:spacing w:after="120"/>
-        <w:ind w:firstLine="360"/>
-        <w:jc w:val="both"/>
-      </w:pPr>
-      <w:r>
-        <w:rPr>
-          <w:rFonts w:ascii="Times New Roman" w:hAnsi="Times New Roman"/>
-          <w:sz w:val="24"/>
-        </w:rPr>
-        <w:t>test_f1 = 0.762 ± 0.016.</w:t>
-      </w:r>
-    </w:p>
-    <w:p>
-      <w:pPr>
-        <w:spacing w:after="120"/>
-        <w:ind w:firstLine="360"/>
-        <w:jc w:val="both"/>
-      </w:pPr>
-      <w:r>
-        <w:rPr>
-          <w:rFonts w:ascii="Times New Roman" w:hAnsi="Times New Roman"/>
-          <w:sz w:val="24"/>
-        </w:rPr>
-        <w:t>Как и в базовой серии, внешние табличные методы остаются сильнее по чистой метрике; наиболее сильным baseline здесь снова выступает градиентный бустинг:</w:t>
-      </w:r>
-    </w:p>
-    <w:p>
-      <w:pPr>
-        <w:spacing w:after="120"/>
-        <w:ind w:firstLine="360"/>
-        <w:jc w:val="both"/>
-      </w:pPr>
-      <w:r>
-        <w:rPr>
-          <w:rFonts w:ascii="Times New Roman" w:hAnsi="Times New Roman"/>
-          <w:sz w:val="24"/>
-        </w:rPr>
-        <w:t>test_accuracy = 0.901 ± 0.001</w:t>
-      </w:r>
-    </w:p>
-    <w:p>
-      <w:pPr>
-        <w:spacing w:after="120"/>
-        <w:ind w:firstLine="360"/>
-        <w:jc w:val="both"/>
-      </w:pPr>
-      <w:r>
-        <w:rPr>
-          <w:rFonts w:ascii="Times New Roman" w:hAnsi="Times New Roman"/>
-          <w:sz w:val="24"/>
-        </w:rPr>
-        <w:t>и</w:t>
-      </w:r>
-    </w:p>
-    <w:p>
-      <w:pPr>
-        <w:spacing w:after="120"/>
-        <w:ind w:firstLine="360"/>
-        <w:jc w:val="both"/>
-      </w:pPr>
-      <w:r>
-        <w:rPr>
-          <w:rFonts w:ascii="Times New Roman" w:hAnsi="Times New Roman"/>
-          <w:sz w:val="24"/>
-        </w:rPr>
-        <w:t>test_f1 = 0.901 ± 0.001.</w:t>
-      </w:r>
-    </w:p>
-    <w:p>
-      <w:pPr>
-        <w:spacing w:after="120"/>
-        <w:ind w:firstLine="360"/>
-        <w:jc w:val="both"/>
-      </w:pPr>
-      <w:r>
-        <w:rPr>
-          <w:rFonts w:ascii="Times New Roman" w:hAnsi="Times New Roman"/>
-          <w:sz w:val="24"/>
-        </w:rPr>
-        <w:t>Содержательно эта дополнительная серия важна тем, что она не меняет общий вывод статьи, но делает его более устойчивым. На увеличенных выборках глубокие режимы вновь оказываются лучше плоского baseline внутри семейства RuFLEX и тем самым поддерживают гипотезу о том, что при росте объема данных преимущества умеренной глубины проявляются отчетливее. Одновременно enlarged-серия не отменяет платформенного позиционирования работы: даже при росте выборки RuFLEX пока не превосходит сильные внешние бустинговые и ансамблевые baseline-модели по абсолютной метрике.</w:t>
-      </w:r>
-    </w:p>
-    <w:p>
-      <w:pPr>
-        <w:pStyle w:val="Heading1"/>
-        <w:jc w:val="left"/>
-      </w:pPr>
-      <w:r>
-        <w:t>13. Ограничения и границы интерпретации</w:t>
-      </w:r>
-    </w:p>
-    <w:p>
-      <w:pPr>
-        <w:spacing w:after="120"/>
-        <w:ind w:firstLine="360"/>
-        <w:jc w:val="both"/>
-      </w:pPr>
-      <w:r>
-        <w:rPr>
-          <w:rFonts w:ascii="Times New Roman" w:hAnsi="Times New Roman"/>
-          <w:sz w:val="24"/>
-        </w:rPr>
-        <w:t>Текущая версия статьи допускает несколько устойчивых выводов.</w:t>
+        <w:t>Проведенное исследование допускает несколько устойчивых выводов.</w:t>
       </w:r>
     </w:p>
     <w:p>
@@ -3147,7 +2139,7 @@
           <w:rFonts w:ascii="Times New Roman" w:hAnsi="Times New Roman"/>
           <w:sz w:val="24"/>
         </w:rPr>
-        <w:t>В-четвертых, на текущих табличных данных глубокий режим не обязан быть лучшим по чистой метрике среди всех внешних baseline-моделей, включая градиентный бустинг и случайный лес, и это не противоречит платформенной ценности RuFLEX.</w:t>
+        <w:t>В-четвертых, на текущих табличных данных глубокий режим не обязан быть лучшим по чистой метрике среди всех внешних сравнительных моделей, включая градиентный бустинг и случайный лес, и это не противоречит платформенной ценности RuFLEX.</w:t>
       </w:r>
     </w:p>
     <w:p>
@@ -3161,7 +2153,7 @@
           <w:rFonts w:ascii="Times New Roman" w:hAnsi="Times New Roman"/>
           <w:sz w:val="24"/>
         </w:rPr>
-        <w:t>В-пятых, независимая задача Covertype Binary Geo выявляет ограничение текущего табличного контура и тем самым содержательно поддерживает необходимость дальнейшего развития пространственного модуля.</w:t>
+        <w:t>В-пятых, независимая задача Covertype Binary Geo показывает, что конфигурации с прямой передачей признаковой информации снимают внутреннюю деградацию строгого последовательного глубокого контура, но не устраняют полностью разрыв с сильными внешними сравнительными моделями и тем самым поддерживают необходимость дальнейшего развития пространственного модуля.</w:t>
       </w:r>
     </w:p>
     <w:p>
@@ -3175,7 +2167,7 @@
           <w:rFonts w:ascii="Times New Roman" w:hAnsi="Times New Roman"/>
           <w:sz w:val="24"/>
         </w:rPr>
-        <w:t>Наряду с этим в статье сознательно удерживаются границы утверждений. Пространственный сверточный контур представлен как архитектурно включенный и расширяемый модуль, но не как уже зрелая и широко верифицированная прикладная подсистема. Аналогично логическая прослеживаемость правил и контрфактуальный анализ рассматриваются как естественное направление развития текущего интерпретационного контура, а не как полностью завершенные пользовательские режимы. Точно так же экспериментальные результаты текущей версии статьи не следует трактовать как окончательный full-data verdict: базовая серия относится к контролируемому benchmark-сценарию на фиксированных подвыборках, тогда как дополнительная enlarged-проверка лишь частично усиливает выводы и не заменяет более широкого full-data исследования с большим числом seed.</w:t>
+        <w:t>Наряду с этим в статье сознательно удерживаются границы утверждений. Пространственный сверточный контур представлен как архитектурно включенный и расширяемый модуль, но не как уже зрелая и широко верифицированная прикладная подсистема. Аналогично логическая прослеживаемость правил и контрфактуальный анализ рассматриваются как естественное направление развития интерпретационного контура, а не как полностью завершенные пользовательские режимы. Точно так же экспериментальные результаты статьи не следует трактовать как окончательный итог на полных датасетах: базовая серия относится к контролируемому сравнительному сценарию на фиксированных подвыборках, тогда как дополнительная проверка на увеличенных выборках лишь частично усиливает выводы и не заменяет более широкого исследования с большим числом seed.</w:t>
       </w:r>
     </w:p>
     <w:p>
@@ -3198,7 +2190,7 @@
           <w:rFonts w:ascii="Times New Roman" w:hAnsi="Times New Roman"/>
           <w:sz w:val="24"/>
         </w:rPr>
-        <w:t>В финальный пакет включены три схемы, отражающие архитектуру платформы, модельный контур и контур интерпретации. Дополнительно подготовлены boards и краткие обзорные графики по трем benchmark-задачам. Такое визуальное сопровождение позволяет отделить системную архитектуру платформы от численных результатов и сделать подачу статьи более прозрачной.</w:t>
+        <w:t>В финальный пакет включены три схемы, отражающие архитектуру платформы, модельный контур и контур интерпретации. Дополнительно подготовлены сравнительные панели и краткие обзорные графики по трем задачам. Такое визуальное сопровождение позволяет отделить системную архитектуру платформы от численных результатов и сделать подачу статьи более прозрачной.</w:t>
       </w:r>
     </w:p>
     <w:p>
@@ -3249,7 +2241,7 @@
           <w:rFonts w:ascii="Times New Roman" w:hAnsi="Times New Roman"/>
           <w:sz w:val="24"/>
         </w:rPr>
-        <w:t>Финальная многосидовая серия показывает, что умеренная глубина усиливает RuFLEX относительно плоского базового режима на регрессионной постановке, тогда как сильные внешние табличные методы, прежде всего градиентный бустинг и случайный лес, на компактных табличных выборках могут быть лучше по чистой метрике. Дополнительная enlarged-проверка на полном California Housing Regression и на увеличенной California Value Binary Geo не меняет этого позиционирования, но подтверждает сохранение внутреннего выигрыша глубоких режимов над плоским baseline при росте объема данных. Covertype Binary Geo, в свою очередь, выявляет границу текущего табличного контура и тем самым подчеркивает необходимость дальнейшего развития пространственного направления.</w:t>
+        <w:t>Финальная многосидовая серия показывает, что для реализованных глубоких режимов RuFLEX ключевым оказывается не просто число скрытых стадий, а способ поступления исходных признаков и скрытых концептов к решающему слою. Конфигурации с прямой передачей признаковой информации резко улучшают внутренние результаты платформы относительно строгой последовательной схемы как на California-задачах, так и на Covertype. Дополнительная проверка на полном California Housing Regression и на увеличенной California Value Binary Geo не меняет платформенного позиционирования работы, но подтверждает, что именно такие конфигурации раскрываются сильнее при росте объема данных. Covertype Binary Geo, в свою очередь, уже не фиксирует внутренний крах глубокого контура, а указывает на сохраняющийся разрыв с сильными древесными ансамблями и другими внешними сравнительными моделями и тем самым подчеркивает необходимость дальнейшего развития пространственного направления.</w:t>
       </w:r>
     </w:p>
     <w:sectPr>

</xml_diff>